<commit_message>
fix: improve LINE integration with auto-log IDs to sheet and detailed error logging
</commit_message>
<xml_diff>
--- a/user_manual.docx
+++ b/user_manual.docx
@@ -999,7 +999,7 @@
     </w:p>
     <w:p>
       <w:r>
-        <w:t>6. คัดลอกลิงก์ เว็บแอป URL (Web app URL) ที่ระบบให้มา</w:t>
+        <w:t>6. คัดลอกลิงก์ เว็บแอป URL (Web app URL) ที่ระบบให้มาเพื่อนำมาใส่ในหน้าเว็บแอปพลิเคชัน</w:t>
       </w:r>
     </w:p>
     <w:p>
@@ -1027,7 +1027,159 @@
     </w:p>
     <w:p>
       <w:r>
-        <w:t>4. ใส่ LINE Bot Token และ LINE Group ID (สำหรับกลุ่มแจ้งเตือนช่าง) จากนั้นกดบันทึกข้อมูลและสามารถกดทดสอบยิงแจ้งเตือนเพื่อใช้งานได้ทันทีครับ</w:t>
+        <w:t>4. ใส่ LINE Bot Token (Channel Access Token)</w:t>
+      </w:r>
+    </w:p>
+    <w:p>
+      <w:r>
+        <w:t>5. ทำการกดยืนยันบันทึกการตั้งค่า</w:t>
+      </w:r>
+    </w:p>
+    <w:p>
+      <w:pPr>
+        <w:pStyle w:val="Heading3"/>
+      </w:pPr>
+      <w:r>
+        <w:t>3. การดึง LINE Group ID / User ID และตั้งค่า Webhook (หมดห่วงเรื่องหา ID ไม่เจอ)</w:t>
+      </w:r>
+    </w:p>
+    <w:p>
+      <w:r>
+        <w:t>เนื่องจากการส่งข้อความทาง LINE OA (Messaging API) จำเป็นต้องระบุรหัสประจำตัวของห้องแชต (User ID สำหรับคุยเดี่ยว หรือ Group ID สำหรับส่งเข้ากลุ่ม) ซึ่งไม่สามารถดูได้จากแอปทั่วไป ระบบจึงได้เตรียมชุดอำนวยความสะดวกสำหรับบันทึก ID ไว้ดังนี้:</w:t>
+      </w:r>
+    </w:p>
+    <w:p>
+      <w:r>
+        <w:t>1. นำ เว็บแอป URL (Web app URL) ที่ได้จาก Apps Script ในส่วนที่ 1 ไปใส่ในหน้า LINE Developers Console ของบอทท่าน:</w:t>
+      </w:r>
+    </w:p>
+    <w:p>
+      <w:pPr>
+        <w:pStyle w:val="ListBullet"/>
+      </w:pPr>
+      <w:r>
+        <w:t>เข้าสู่ระบบ LINE Developers -&gt; ไปที่หน้าการตั้งค่าบอทของคุณ -&gt; แท็บ Messaging API</w:t>
+      </w:r>
+    </w:p>
+    <w:p>
+      <w:pPr>
+        <w:pStyle w:val="ListBullet"/>
+      </w:pPr>
+      <w:r>
+        <w:t>หาหัวข้อ Webhook URL จากนั้นวางลิงก์เว็บแอป URL ลงไป แล้วกดบันทึก (Save)</w:t>
+      </w:r>
+    </w:p>
+    <w:p>
+      <w:pPr>
+        <w:pStyle w:val="ListBullet"/>
+      </w:pPr>
+      <w:r>
+        <w:t>กดเปิดใช้งานสวิตช์ Use Webhook 🟢</w:t>
+      </w:r>
+    </w:p>
+    <w:p>
+      <w:r>
+        <w:t>2. วิธีการหา ID จาก Google Sheets:</w:t>
+      </w:r>
+    </w:p>
+    <w:p>
+      <w:pPr>
+        <w:pStyle w:val="ListBullet"/>
+      </w:pPr>
+      <w:r>
+        <w:t>ให้ผู้ใช้เพิ่มบอทเป็นเพื่อน (คุย 1-ต่อ-1) หรือทำการดึงบอท (LINE OA) เข้าไปในกลุ่มแชตของทีมช่าง</w:t>
+      </w:r>
+    </w:p>
+    <w:p>
+      <w:pPr>
+        <w:pStyle w:val="ListBullet"/>
+      </w:pPr>
+      <w:r>
+        <w:t>พิมพ์คำใดก็ได้ส่งแชตหาบอท (เช่น ส่งคำว่า "ทดสอบระบบ")</w:t>
+      </w:r>
+    </w:p>
+    <w:p>
+      <w:pPr>
+        <w:pStyle w:val="ListBullet"/>
+      </w:pPr>
+      <w:r>
+        <w:t>บอทจะทำการตรวจสอบและนำ ID นั้นมาเขียนบันทึกไว้ใน Google Sheet ของคุณ ในชีตใหม่ชื่อ `LINE_IDs` โดยอัตโนมัติ!</w:t>
+      </w:r>
+    </w:p>
+    <w:p>
+      <w:pPr>
+        <w:pStyle w:val="ListBullet"/>
+      </w:pPr>
+      <w:r>
+        <w:t>เปิด Google Sheets ไปที่ชีต `LINE_IDs` แล้วก๊อปปี้ค่า ID ที่ขึ้นต้นด้วย `U...` (สำหรับผู้ใช้เดี่ยว) หรือ `C...` (สำหรับกลุ่มแชต) มาวางลงในช่อง "LINE Group ID / User ID" ในหน้าตั้งค่าแอปพลิเคชัน แล้วกดยืนยันบันทึก</w:t>
+      </w:r>
+    </w:p>
+    <w:p>
+      <w:pPr>
+        <w:pStyle w:val="Heading3"/>
+      </w:pPr>
+      <w:r>
+        <w:t>4. การตรวจสอบสถานะและแก้ไขปัญหาการแจ้งเตือน (Debugging LINE Notification)</w:t>
+      </w:r>
+    </w:p>
+    <w:p>
+      <w:r>
+        <w:t>เมื่อทำรายการเบิกจ่ายคลังแล้วข้อความยังไม่ขึ้นเตือนในห้องแชต ให้ตรวจสอบความผิดพลาดได้ง่ายๆ ดังนี้:</w:t>
+      </w:r>
+    </w:p>
+    <w:p>
+      <w:r>
+        <w:t>1. เปิดไฟล์ Google Sheet ของคุณ ไปดูที่ตารางชีตชื่อ `LINE_Logs` ที่ระบบสร้างขึ้นมาให้โดยอัตโนมัติ</w:t>
+      </w:r>
+    </w:p>
+    <w:p>
+      <w:r>
+        <w:t>2. สังเกตช่อง "ผลการทำงาน" ของแต่ละแถวส่งข้อความ:</w:t>
+      </w:r>
+    </w:p>
+    <w:p>
+      <w:pPr>
+        <w:pStyle w:val="ListBullet"/>
+      </w:pPr>
+      <w:r>
+        <w:t>ส่งสำเร็จ: การเชื่อมต่อ LINE API สมบูรณ์</w:t>
+      </w:r>
+    </w:p>
+    <w:p>
+      <w:pPr>
+        <w:pStyle w:val="ListBullet"/>
+      </w:pPr>
+      <w:r>
+        <w:t>ล้มเหลว (พร้อมรายละเอียดข้อผิดพลาด): ระบบจะโชว์เหตุผลที่ทำให้การส่งไม่ถึงปลายทาง เช่น:</w:t>
+      </w:r>
+    </w:p>
+    <w:p>
+      <w:pPr>
+        <w:pStyle w:val="ListBullet"/>
+      </w:pPr>
+      <w:r>
+        <w:t>`{"message":"The property, 'to', is invalid..."}` -&gt; แสดงว่าใส่ค่า ID ในช่องตั้งค่าไม่ถูกต้อง (ต้องดึง ID แท้จริงจากชีต `LINE_IDs` เท่านั้น)</w:t>
+      </w:r>
+    </w:p>
+    <w:p>
+      <w:pPr>
+        <w:pStyle w:val="ListBullet"/>
+      </w:pPr>
+      <w:r>
+        <w:t>`{"message":"Invalid access token"}` -&gt; แสดงว่าคัดลอก Token มาไม่ครบถ้วน หรือทำสิทธิ์หายระหว่างทาง</w:t>
+      </w:r>
+    </w:p>
+    <w:p>
+      <w:pPr>
+        <w:pStyle w:val="ListBullet"/>
+      </w:pPr>
+      <w:r>
+        <w:t>หากบอทไม่ได้อยู่ในกลุ่มแชต ก็จะแสดงสถานะจัดส่งล้มเหลวจากตัว LINE API เช่นกัน ให้ทำการดึงบอทเข้ากลุ่มก่อนใช้งาน</w:t>
+      </w:r>
+    </w:p>
+    <w:p>
+      <w:r>
+        <w:t>3. ช่างคอมพิวเตอร์ยังสามารถเปิดดูบันทึกเหตุการณ์แบบเรียลไทม์ได้จากเมนู "ประวัติการเรียกใช้งาน" (Executions) บนแถบด้านซ้ายมือของหน้า Apps Script เพื่อดูประวัติการร้องขอแบบเจาะลึกได้อีกด้วยครับ</w:t>
       </w:r>
     </w:p>
     <w:sectPr>

</xml_diff>